<commit_message>
docs: bring the process document up to the pump defaults and Planning view
</commit_message>
<xml_diff>
--- a/docs/Upande-Irrigation-End-to-End-Process.docx
+++ b/docs/Upande-Irrigation-End-to-End-Process.docx
@@ -2345,9 +2345,10 @@
         <w:tblLayout w:type="fixed"/>
       </w:tblPr>
       <w:tblGrid>
-        <w:gridCol w:w="2304"/>
-        <w:gridCol w:w="4896"/>
-        <w:gridCol w:w="1440"/>
+        <w:gridCol w:w="2232"/>
+        <w:gridCol w:w="4032"/>
+        <w:gridCol w:w="1224"/>
+        <w:gridCol w:w="1296"/>
       </w:tblGrid>
       <w:tr>
         <w:trPr>
@@ -2355,7 +2356,7 @@
         </w:trPr>
         <w:tc>
           <w:tcPr>
-            <w:tcW w:type="dxa" w:w="2304"/>
+            <w:tcW w:type="dxa" w:w="2232"/>
             <w:shd w:val="clear" w:fill="2F2C28"/>
           </w:tcPr>
           <w:p>
@@ -2374,7 +2375,7 @@
         </w:tc>
         <w:tc>
           <w:tcPr>
-            <w:tcW w:type="dxa" w:w="4896"/>
+            <w:tcW w:type="dxa" w:w="4032"/>
             <w:shd w:val="clear" w:fill="2F2C28"/>
           </w:tcPr>
           <w:p>
@@ -2393,7 +2394,7 @@
         </w:tc>
         <w:tc>
           <w:tcPr>
-            <w:tcW w:type="dxa" w:w="1440"/>
+            <w:tcW w:type="dxa" w:w="1224"/>
             <w:shd w:val="clear" w:fill="2F2C28"/>
           </w:tcPr>
           <w:p>
@@ -2406,7 +2407,26 @@
                 <w:color w:val="FFFFFF"/>
                 <w:sz w:val="19"/>
               </w:rPr>
-              <w:t>Current value</w:t>
+              <w:t>Default</w:t>
+            </w:r>
+          </w:p>
+        </w:tc>
+        <w:tc>
+          <w:tcPr>
+            <w:tcW w:type="dxa" w:w="1296"/>
+            <w:shd w:val="clear" w:fill="2F2C28"/>
+          </w:tcPr>
+          <w:p>
+            <w:pPr>
+              <w:spacing w:after="40" w:before="40"/>
+            </w:pPr>
+            <w:r>
+              <w:rPr>
+                <w:b/>
+                <w:color w:val="FFFFFF"/>
+                <w:sz w:val="19"/>
+              </w:rPr>
+              <w:t>Per shift?</w:t>
             </w:r>
           </w:p>
         </w:tc>
@@ -2414,7 +2434,7 @@
       <w:tr>
         <w:tc>
           <w:tcPr>
-            <w:tcW w:type="dxa" w:w="2304"/>
+            <w:tcW w:type="dxa" w:w="2232"/>
           </w:tcPr>
           <w:p>
             <w:pPr>
@@ -2431,7 +2451,7 @@
         </w:tc>
         <w:tc>
           <w:tcPr>
-            <w:tcW w:type="dxa" w:w="4896"/>
+            <w:tcW w:type="dxa" w:w="4032"/>
           </w:tcPr>
           <w:p>
             <w:pPr>
@@ -2447,7 +2467,7 @@
         </w:tc>
         <w:tc>
           <w:tcPr>
-            <w:tcW w:type="dxa" w:w="1440"/>
+            <w:tcW w:type="dxa" w:w="1224"/>
           </w:tcPr>
           <w:p>
             <w:pPr>
@@ -2458,6 +2478,22 @@
                 <w:sz w:val="18"/>
               </w:rPr>
               <w:t>0.65</w:t>
+            </w:r>
+          </w:p>
+        </w:tc>
+        <w:tc>
+          <w:tcPr>
+            <w:tcW w:type="dxa" w:w="1296"/>
+          </w:tcPr>
+          <w:p>
+            <w:pPr>
+              <w:spacing w:after="40" w:before="40"/>
+            </w:pPr>
+            <w:r>
+              <w:rPr>
+                <w:sz w:val="18"/>
+              </w:rPr>
+              <w:t>farm-wide</w:t>
             </w:r>
           </w:p>
         </w:tc>
@@ -2465,7 +2501,7 @@
       <w:tr>
         <w:tc>
           <w:tcPr>
-            <w:tcW w:type="dxa" w:w="2304"/>
+            <w:tcW w:type="dxa" w:w="2232"/>
             <w:shd w:val="clear" w:fill="FAF9F6"/>
           </w:tcPr>
           <w:p>
@@ -2483,7 +2519,7 @@
         </w:tc>
         <w:tc>
           <w:tcPr>
-            <w:tcW w:type="dxa" w:w="4896"/>
+            <w:tcW w:type="dxa" w:w="4032"/>
             <w:shd w:val="clear" w:fill="FAF9F6"/>
           </w:tcPr>
           <w:p>
@@ -2500,7 +2536,7 @@
         </w:tc>
         <w:tc>
           <w:tcPr>
-            <w:tcW w:type="dxa" w:w="1440"/>
+            <w:tcW w:type="dxa" w:w="1224"/>
             <w:shd w:val="clear" w:fill="FAF9F6"/>
           </w:tcPr>
           <w:p>
@@ -2512,6 +2548,23 @@
                 <w:sz w:val="18"/>
               </w:rPr>
               <w:t>2.8 mm/hr</w:t>
+            </w:r>
+          </w:p>
+        </w:tc>
+        <w:tc>
+          <w:tcPr>
+            <w:tcW w:type="dxa" w:w="1296"/>
+            <w:shd w:val="clear" w:fill="FAF9F6"/>
+          </w:tcPr>
+          <w:p>
+            <w:pPr>
+              <w:spacing w:after="40" w:before="40"/>
+            </w:pPr>
+            <w:r>
+              <w:rPr>
+                <w:sz w:val="18"/>
+              </w:rPr>
+              <w:t>yes — Block Type</w:t>
             </w:r>
           </w:p>
         </w:tc>
@@ -2519,7 +2572,7 @@
       <w:tr>
         <w:tc>
           <w:tcPr>
-            <w:tcW w:type="dxa" w:w="2304"/>
+            <w:tcW w:type="dxa" w:w="2232"/>
           </w:tcPr>
           <w:p>
             <w:pPr>
@@ -2536,7 +2589,7 @@
         </w:tc>
         <w:tc>
           <w:tcPr>
-            <w:tcW w:type="dxa" w:w="4896"/>
+            <w:tcW w:type="dxa" w:w="4032"/>
           </w:tcPr>
           <w:p>
             <w:pPr>
@@ -2552,7 +2605,7 @@
         </w:tc>
         <w:tc>
           <w:tcPr>
-            <w:tcW w:type="dxa" w:w="1440"/>
+            <w:tcW w:type="dxa" w:w="1224"/>
           </w:tcPr>
           <w:p>
             <w:pPr>
@@ -2563,6 +2616,22 @@
                 <w:sz w:val="18"/>
               </w:rPr>
               <w:t>70 %</w:t>
+            </w:r>
+          </w:p>
+        </w:tc>
+        <w:tc>
+          <w:tcPr>
+            <w:tcW w:type="dxa" w:w="1296"/>
+          </w:tcPr>
+          <w:p>
+            <w:pPr>
+              <w:spacing w:after="40" w:before="40"/>
+            </w:pPr>
+            <w:r>
+              <w:rPr>
+                <w:sz w:val="18"/>
+              </w:rPr>
+              <w:t>yes — Block Type</w:t>
             </w:r>
           </w:p>
         </w:tc>
@@ -2570,7 +2639,7 @@
       <w:tr>
         <w:tc>
           <w:tcPr>
-            <w:tcW w:type="dxa" w:w="2304"/>
+            <w:tcW w:type="dxa" w:w="2232"/>
             <w:shd w:val="clear" w:fill="FAF9F6"/>
           </w:tcPr>
           <w:p>
@@ -2588,7 +2657,7 @@
         </w:tc>
         <w:tc>
           <w:tcPr>
-            <w:tcW w:type="dxa" w:w="4896"/>
+            <w:tcW w:type="dxa" w:w="4032"/>
             <w:shd w:val="clear" w:fill="FAF9F6"/>
           </w:tcPr>
           <w:p>
@@ -2605,7 +2674,7 @@
         </w:tc>
         <w:tc>
           <w:tcPr>
-            <w:tcW w:type="dxa" w:w="1440"/>
+            <w:tcW w:type="dxa" w:w="1224"/>
             <w:shd w:val="clear" w:fill="FAF9F6"/>
           </w:tcPr>
           <w:p>
@@ -2616,7 +2685,24 @@
               <w:rPr>
                 <w:sz w:val="18"/>
               </w:rPr>
-              <w:t>per shift</w:t>
+              <w:t>—</w:t>
+            </w:r>
+          </w:p>
+        </w:tc>
+        <w:tc>
+          <w:tcPr>
+            <w:tcW w:type="dxa" w:w="1296"/>
+            <w:shd w:val="clear" w:fill="FAF9F6"/>
+          </w:tcPr>
+          <w:p>
+            <w:pPr>
+              <w:spacing w:after="40" w:before="40"/>
+            </w:pPr>
+            <w:r>
+              <w:rPr>
+                <w:sz w:val="18"/>
+              </w:rPr>
+              <w:t>always</w:t>
             </w:r>
           </w:p>
         </w:tc>
@@ -2626,6 +2712,38 @@
       <w:pPr>
         <w:spacing w:after="40"/>
       </w:pPr>
+    </w:p>
+    <w:p>
+      <w:r>
+        <w:rPr>
+          <w:b w:val="0"/>
+          <w:i w:val="0"/>
+        </w:rPr>
+        <w:t xml:space="preserve">Rate and coverage are the two levers that change a shift's hours, and both can be set per shift on Block Type; blank or zero inherits the farm default. Note what is </w:t>
+      </w:r>
+      <w:r>
+        <w:rPr>
+          <w:b w:val="0"/>
+          <w:i/>
+        </w:rPr>
+        <w:t>not</w:t>
+      </w:r>
+      <w:r>
+        <w:rPr>
+          <w:b w:val="0"/>
+          <w:i w:val="0"/>
+        </w:rPr>
+        <w:t xml:space="preserve"> a lever: irrigated area. Depth in millimetres is measured per unit area, so a larger shift does not need a longer run — it needs more flow. A shift that genuinely differs differs in its emitters, and that is what the override captures.</w:t>
+      </w:r>
+    </w:p>
+    <w:p>
+      <w:r>
+        <w:rPr>
+          <w:b w:val="0"/>
+          <w:i w:val="0"/>
+        </w:rPr>
+        <w:t>By default every shift on a farm therefore computes identically, which is intended: the model holds nothing else that distinguishes them yet. applied_rate_mm_hr and applied_coverage_pct are written onto each planner, so the hours stay auditable after a default is changed.</w:t>
+      </w:r>
     </w:p>
     <w:p>
       <w:pPr>
@@ -2840,7 +2958,31 @@
                 <w:rFonts w:ascii="Consolas" w:hAnsi="Consolas"/>
                 <w:sz w:val="18"/>
               </w:rPr>
-              <w:t>no profile, or either figure missing:  168 hr/wk, flagged UNVERIFIED</w:t>
+              <w:t>1. the section's Irrigation Pump Profile        source = profile   A MEASURED LIMIT</w:t>
+            </w:r>
+          </w:p>
+          <w:p>
+            <w:pPr>
+              <w:spacing w:after="0" w:before="0"/>
+            </w:pPr>
+            <w:r>
+              <w:rPr>
+                <w:rFonts w:ascii="Consolas" w:hAnsi="Consolas"/>
+                <w:sz w:val="18"/>
+              </w:rPr>
+              <w:t>2. the Irrigation Settings farm-wide defaults   source = default   a stated assumption</w:t>
+            </w:r>
+          </w:p>
+          <w:p>
+            <w:pPr>
+              <w:spacing w:after="0" w:before="0"/>
+            </w:pPr>
+            <w:r>
+              <w:rPr>
+                <w:rFonts w:ascii="Consolas" w:hAnsi="Consolas"/>
+                <w:sz w:val="18"/>
+              </w:rPr>
+              <w:t>3. a full week                                  source = fallback  last resort</w:t>
             </w:r>
           </w:p>
         </w:tc>
@@ -2857,14 +2999,39 @@
           <w:b w:val="0"/>
           <w:i w:val="0"/>
         </w:rPr>
-        <w:t xml:space="preserve">With no Irrigation Pump Profile there is no capacity to allocate against. The engine assumes a full week and says so on every affected planner. It never presents an assumed number as a limit. </w:t>
+        <w:t xml:space="preserve">Only the first is a fact. Where a section has no profile the engine falls to the farm-wide defaults — </w:t>
+      </w:r>
+      <w:r>
+        <w:rPr>
+          <w:rFonts w:ascii="Consolas" w:hAnsi="Consolas"/>
+          <w:b w:val="0"/>
+          <w:i w:val="0"/>
+          <w:sz w:val="19"/>
+        </w:rPr>
+        <w:t>3500 m³/wk at 25 m³/hr = 140 hr/wk</w:t>
+      </w:r>
+      <w:r>
+        <w:rPr>
+          <w:b w:val="0"/>
+          <w:i w:val="0"/>
+        </w:rPr>
+        <w:t xml:space="preserve">, i.e. 20 h/day leaving four hours for maintenance — and names that figure and its provenance on every planner it touches. </w:t>
       </w:r>
       <w:r>
         <w:rPr>
           <w:b/>
           <w:i w:val="0"/>
         </w:rPr>
-        <w:t>The live site currently has zero pump profiles, so this is the active path.</w:t>
+        <w:t>The live site has no pump profiles, so the defaults are the active path.</w:t>
+      </w:r>
+    </w:p>
+    <w:p>
+      <w:r>
+        <w:rPr>
+          <w:b w:val="0"/>
+          <w:i w:val="0"/>
+        </w:rPr>
+        <w:t>Capping is reported whatever the provenance: an operator needs to know a shift was cut short, and the provenance line says how firm the limit is. The same two figures are the DocField defaults on Irrigation Pump Profile, so creating one is a matter of correcting two numbers rather than sourcing them.</w:t>
       </w:r>
     </w:p>
     <w:p>
@@ -3109,7 +3276,7 @@
           <w:i w:val="0"/>
           <w:sz w:val="19"/>
         </w:rPr>
-        <w:t>IRPL-2026-01019</w:t>
+        <w:t>IRPL-2026-02504</w:t>
       </w:r>
       <w:r>
         <w:rPr>
@@ -3619,7 +3786,7 @@
               <w:rPr>
                 <w:sz w:val="18"/>
               </w:rPr>
-              <w:t>Pump capacity</w:t>
+              <w:t>Applied rate</w:t>
             </w:r>
           </w:p>
         </w:tc>
@@ -3635,7 +3802,7 @@
               <w:rPr>
                 <w:sz w:val="18"/>
               </w:rPr>
-              <w:t>no profile for this section</w:t>
+              <w:t>no Block Type override → farm defaults</w:t>
             </w:r>
           </w:p>
         </w:tc>
@@ -3651,7 +3818,7 @@
               <w:rPr>
                 <w:sz w:val="18"/>
               </w:rPr>
-              <w:t>168 hr/wk, unverified</w:t>
+              <w:t>2.8 mm/hr at 70 % coverage</w:t>
             </w:r>
           </w:p>
         </w:tc>
@@ -3670,7 +3837,7 @@
               <w:rPr>
                 <w:sz w:val="18"/>
               </w:rPr>
-              <w:t>Capping factor</w:t>
+              <w:t>Pump capacity</w:t>
             </w:r>
           </w:p>
         </w:tc>
@@ -3687,7 +3854,7 @@
               <w:rPr>
                 <w:sz w:val="18"/>
               </w:rPr>
-              <w:t>168 ÷ (55 shifts × 10.87 hr) = 168 ÷ 597.8</w:t>
+              <w:t>no profile → Irrigation Settings defaults</w:t>
             </w:r>
           </w:p>
         </w:tc>
@@ -3704,7 +3871,7 @@
               <w:rPr>
                 <w:sz w:val="18"/>
               </w:rPr>
-              <w:t>0.281</w:t>
+              <w:t>140 hr/wk, source = default</w:t>
             </w:r>
           </w:p>
         </w:tc>
@@ -3722,7 +3889,7 @@
               <w:rPr>
                 <w:sz w:val="18"/>
               </w:rPr>
-              <w:t>Granted hours</w:t>
+              <w:t>Capping factor</w:t>
             </w:r>
           </w:p>
         </w:tc>
@@ -3738,7 +3905,7 @@
               <w:rPr>
                 <w:sz w:val="18"/>
               </w:rPr>
-              <w:t>10.87 × 0.281</w:t>
+              <w:t>140 ÷ (55 shifts × 10.87 hr) = 140 ÷ 597.8</w:t>
             </w:r>
           </w:p>
         </w:tc>
@@ -3754,7 +3921,7 @@
               <w:rPr>
                 <w:sz w:val="18"/>
               </w:rPr>
-              <w:t>3.05 hr</w:t>
+              <w:t>0.234</w:t>
             </w:r>
           </w:p>
         </w:tc>
@@ -3773,7 +3940,7 @@
               <w:rPr>
                 <w:sz w:val="18"/>
               </w:rPr>
-              <w:t>Cycles</w:t>
+              <w:t>Granted hours</w:t>
             </w:r>
           </w:p>
         </w:tc>
@@ -3790,7 +3957,7 @@
               <w:rPr>
                 <w:sz w:val="18"/>
               </w:rPr>
-              <w:t>3.05 ≤ 5.0 hr threshold → cycles_when_below</w:t>
+              <w:t>10.87 × 0.234</w:t>
             </w:r>
           </w:p>
         </w:tc>
@@ -3807,7 +3974,7 @@
               <w:rPr>
                 <w:sz w:val="18"/>
               </w:rPr>
-              <w:t>1 × 3.05 hr</w:t>
+              <w:t>2.55 hr</w:t>
             </w:r>
           </w:p>
         </w:tc>
@@ -3825,7 +3992,7 @@
               <w:rPr>
                 <w:sz w:val="18"/>
               </w:rPr>
-              <w:t>Window</w:t>
+              <w:t>Cycles</w:t>
             </w:r>
           </w:p>
         </w:tc>
@@ -3841,7 +4008,7 @@
               <w:rPr>
                 <w:sz w:val="18"/>
               </w:rPr>
-              <w:t>first in the unknown-pump queue</w:t>
+              <w:t>2.55 ≤ 5.0 hr threshold → cycles_when_below</w:t>
             </w:r>
           </w:p>
         </w:tc>
@@ -3857,7 +4024,7 @@
               <w:rPr>
                 <w:sz w:val="18"/>
               </w:rPr>
-              <w:t>2026-01-08 00:00 → 03:03</w:t>
+              <w:t>1 × 2.55 hr</w:t>
             </w:r>
           </w:p>
         </w:tc>
@@ -3876,7 +4043,7 @@
               <w:rPr>
                 <w:sz w:val="18"/>
               </w:rPr>
-              <w:t>Delivered depth</w:t>
+              <w:t>Window</w:t>
             </w:r>
           </w:p>
         </w:tc>
@@ -3893,7 +4060,7 @@
               <w:rPr>
                 <w:sz w:val="18"/>
               </w:rPr>
-              <w:t>3.05 × 2.8 × 0.70</w:t>
+              <w:t>first in the unknown-pump queue</w:t>
             </w:r>
           </w:p>
         </w:tc>
@@ -3910,7 +4077,7 @@
               <w:rPr>
                 <w:sz w:val="18"/>
               </w:rPr>
-              <w:t>5.99 mm</w:t>
+              <w:t>2026-01-08 00:00 → 02:33</w:t>
             </w:r>
           </w:p>
         </w:tc>
@@ -3928,7 +4095,7 @@
               <w:rPr>
                 <w:sz w:val="18"/>
               </w:rPr>
-              <w:t>Unmet</w:t>
+              <w:t>Delivered depth</w:t>
             </w:r>
           </w:p>
         </w:tc>
@@ -3944,7 +4111,7 @@
               <w:rPr>
                 <w:sz w:val="18"/>
               </w:rPr>
-              <w:t>21.3038 − 5.99</w:t>
+              <w:t>2.55 × 2.8 × 0.70</w:t>
             </w:r>
           </w:p>
         </w:tc>
@@ -3960,7 +4127,7 @@
               <w:rPr>
                 <w:sz w:val="18"/>
               </w:rPr>
-              <w:t>15.32 mm — carries to 2026-01-15</w:t>
+              <w:t>4.99 mm</w:t>
             </w:r>
           </w:p>
         </w:tc>
@@ -3979,7 +4146,7 @@
               <w:rPr>
                 <w:sz w:val="18"/>
               </w:rPr>
-              <w:t>Disease index</w:t>
+              <w:t>Unmet</w:t>
             </w:r>
           </w:p>
         </w:tc>
@@ -3996,7 +4163,7 @@
               <w:rPr>
                 <w:sz w:val="18"/>
               </w:rPr>
-              <w:t>Z from mean temp and 0.00 mm rain</w:t>
+              <w:t>21.3038 − 4.99</w:t>
             </w:r>
           </w:p>
         </w:tc>
@@ -4004,6 +4171,56 @@
           <w:tcPr>
             <w:tcW w:type="dxa" w:w="3024"/>
             <w:shd w:val="clear" w:fill="FAF9F6"/>
+          </w:tcPr>
+          <w:p>
+            <w:pPr>
+              <w:spacing w:after="40" w:before="40"/>
+            </w:pPr>
+            <w:r>
+              <w:rPr>
+                <w:sz w:val="18"/>
+              </w:rPr>
+              <w:t>16.31 mm — carries to 2026-01-15</w:t>
+            </w:r>
+          </w:p>
+        </w:tc>
+      </w:tr>
+      <w:tr>
+        <w:tc>
+          <w:tcPr>
+            <w:tcW w:type="dxa" w:w="1800"/>
+          </w:tcPr>
+          <w:p>
+            <w:pPr>
+              <w:spacing w:after="40" w:before="40"/>
+            </w:pPr>
+            <w:r>
+              <w:rPr>
+                <w:sz w:val="18"/>
+              </w:rPr>
+              <w:t>Disease index</w:t>
+            </w:r>
+          </w:p>
+        </w:tc>
+        <w:tc>
+          <w:tcPr>
+            <w:tcW w:type="dxa" w:w="3816"/>
+          </w:tcPr>
+          <w:p>
+            <w:pPr>
+              <w:spacing w:after="40" w:before="40"/>
+            </w:pPr>
+            <w:r>
+              <w:rPr>
+                <w:sz w:val="18"/>
+              </w:rPr>
+              <w:t>Z from mean temp and 0.00 mm rain</w:t>
+            </w:r>
+          </w:p>
+        </w:tc>
+        <w:tc>
+          <w:tcPr>
+            <w:tcW w:type="dxa" w:w="3024"/>
           </w:tcPr>
           <w:p>
             <w:pPr>
@@ -4059,7 +4276,7 @@
               <w:rPr>
                 <w:sz w:val="19"/>
               </w:rPr>
-              <w:t>23HA · SHIFT 1 lost 21.3 mm and received 6.0 mm. It is not a scheduling error — it is a capacity statement. With 55 shifts sharing one assumed 168 hr week, the farm can return about 28 % of what it loses in a dry week. Creating the Irrigation Pump Profiles is what turns that assumption into a measured fact, and may well raise the ceiling.</w:t>
+              <w:t>23HA · SHIFT 1 lost 21.3 mm and received 5.0 mm. It is not a scheduling error — it is a capacity statement. With 55 shifts sharing one assumed 140 hr week, the farm can return about 23 % of what it loses in a dry week. Creating the Irrigation Pump Profiles is what turns that assumption into a measured fact, and may well raise the ceiling — the default is deliberately conservative.</w:t>
             </w:r>
           </w:p>
         </w:tc>
@@ -4635,7 +4852,7 @@
                 <w:rFonts w:ascii="Consolas" w:hAnsi="Consolas"/>
                 <w:sz w:val="17"/>
               </w:rPr>
-              <w:t>z_value</w:t>
+              <w:t>applied_rate_mm_hr</w:t>
             </w:r>
             <w:r>
               <w:rPr>
@@ -4648,7 +4865,7 @@
                 <w:rFonts w:ascii="Consolas" w:hAnsi="Consolas"/>
                 <w:sz w:val="17"/>
               </w:rPr>
-              <w:t>z_risk_level</w:t>
+              <w:t>applied_coverage_pct</w:t>
             </w:r>
           </w:p>
         </w:tc>
@@ -4664,7 +4881,7 @@
               <w:rPr>
                 <w:sz w:val="18"/>
               </w:rPr>
-              <w:t>Anthracnose index and band.</w:t>
+              <w:t>The two figures that turned millimetres into hours.</w:t>
             </w:r>
           </w:p>
         </w:tc>
@@ -4700,7 +4917,20 @@
                 <w:rFonts w:ascii="Consolas" w:hAnsi="Consolas"/>
                 <w:sz w:val="17"/>
               </w:rPr>
-              <w:t>shift_hours</w:t>
+              <w:t>z_value</w:t>
+            </w:r>
+            <w:r>
+              <w:rPr>
+                <w:sz w:val="18"/>
+              </w:rPr>
+              <w:t xml:space="preserve">, </w:t>
+            </w:r>
+            <w:r>
+              <w:rPr>
+                <w:rFonts w:ascii="Consolas" w:hAnsi="Consolas"/>
+                <w:sz w:val="17"/>
+              </w:rPr>
+              <w:t>z_risk_level</w:t>
             </w:r>
           </w:p>
         </w:tc>
@@ -4717,7 +4947,7 @@
               <w:rPr>
                 <w:sz w:val="18"/>
               </w:rPr>
-              <w:t>Hours actually granted by the allocator.</w:t>
+              <w:t>Anthracnose index and band.</w:t>
             </w:r>
           </w:p>
         </w:tc>
@@ -4734,7 +4964,7 @@
               <w:rPr>
                 <w:sz w:val="18"/>
               </w:rPr>
-              <w:t>Scheduler</w:t>
+              <w:t>Planner hook</w:t>
             </w:r>
           </w:p>
         </w:tc>
@@ -4753,20 +4983,59 @@
                 <w:rFonts w:ascii="Consolas" w:hAnsi="Consolas"/>
                 <w:sz w:val="17"/>
               </w:rPr>
-              <w:t>cycles_count</w:t>
-            </w:r>
+              <w:t>shift_hours</w:t>
+            </w:r>
+          </w:p>
+        </w:tc>
+        <w:tc>
+          <w:tcPr>
+            <w:tcW w:type="dxa" w:w="4176"/>
+          </w:tcPr>
+          <w:p>
+            <w:pPr>
+              <w:spacing w:after="40" w:before="40"/>
+            </w:pPr>
             <w:r>
               <w:rPr>
                 <w:sz w:val="18"/>
               </w:rPr>
-              <w:t xml:space="preserve">, </w:t>
-            </w:r>
+              <w:t>Hours actually granted by the allocator.</w:t>
+            </w:r>
+          </w:p>
+        </w:tc>
+        <w:tc>
+          <w:tcPr>
+            <w:tcW w:type="dxa" w:w="1440"/>
+          </w:tcPr>
+          <w:p>
+            <w:pPr>
+              <w:spacing w:after="40" w:before="40"/>
+            </w:pPr>
+            <w:r>
+              <w:rPr>
+                <w:sz w:val="18"/>
+              </w:rPr>
+              <w:t>Scheduler</w:t>
+            </w:r>
+          </w:p>
+        </w:tc>
+      </w:tr>
+      <w:tr>
+        <w:tc>
+          <w:tcPr>
+            <w:tcW w:type="dxa" w:w="3024"/>
+            <w:shd w:val="clear" w:fill="FAF9F6"/>
+          </w:tcPr>
+          <w:p>
+            <w:pPr>
+              <w:spacing w:after="40" w:before="40"/>
+            </w:pPr>
             <w:r>
               <w:rPr>
                 <w:rFonts w:ascii="Consolas" w:hAnsi="Consolas"/>
                 <w:sz w:val="17"/>
               </w:rPr>
-              <w:t>cycle_hours_each</w:t>
+              <w:t>cycles_count</w:t>
             </w:r>
             <w:r>
               <w:rPr>
@@ -4779,6 +5048,19 @@
                 <w:rFonts w:ascii="Consolas" w:hAnsi="Consolas"/>
                 <w:sz w:val="17"/>
               </w:rPr>
+              <w:t>cycle_hours_each</w:t>
+            </w:r>
+            <w:r>
+              <w:rPr>
+                <w:sz w:val="18"/>
+              </w:rPr>
+              <w:t xml:space="preserve">, </w:t>
+            </w:r>
+            <w:r>
+              <w:rPr>
+                <w:rFonts w:ascii="Consolas" w:hAnsi="Consolas"/>
+                <w:sz w:val="17"/>
+              </w:rPr>
               <w:t>cycle_plan</w:t>
             </w:r>
           </w:p>
@@ -4786,6 +5068,7 @@
         <w:tc>
           <w:tcPr>
             <w:tcW w:type="dxa" w:w="4176"/>
+            <w:shd w:val="clear" w:fill="FAF9F6"/>
           </w:tcPr>
           <w:p>
             <w:pPr>
@@ -4802,6 +5085,7 @@
         <w:tc>
           <w:tcPr>
             <w:tcW w:type="dxa" w:w="1440"/>
+            <w:shd w:val="clear" w:fill="FAF9F6"/>
           </w:tcPr>
           <w:p>
             <w:pPr>
@@ -4820,7 +5104,6 @@
         <w:tc>
           <w:tcPr>
             <w:tcW w:type="dxa" w:w="3024"/>
-            <w:shd w:val="clear" w:fill="FAF9F6"/>
           </w:tcPr>
           <w:p>
             <w:pPr>
@@ -4851,6 +5134,40 @@
         <w:tc>
           <w:tcPr>
             <w:tcW w:type="dxa" w:w="4176"/>
+          </w:tcPr>
+          <w:p>
+            <w:pPr>
+              <w:spacing w:after="40" w:before="40"/>
+            </w:pPr>
+            <w:r>
+              <w:rPr>
+                <w:sz w:val="18"/>
+              </w:rPr>
+              <w:t>First and last moment of the run.</w:t>
+            </w:r>
+          </w:p>
+        </w:tc>
+        <w:tc>
+          <w:tcPr>
+            <w:tcW w:type="dxa" w:w="1440"/>
+          </w:tcPr>
+          <w:p>
+            <w:pPr>
+              <w:spacing w:after="40" w:before="40"/>
+            </w:pPr>
+            <w:r>
+              <w:rPr>
+                <w:sz w:val="18"/>
+              </w:rPr>
+              <w:t>Scheduler</w:t>
+            </w:r>
+          </w:p>
+        </w:tc>
+      </w:tr>
+      <w:tr>
+        <w:tc>
+          <w:tcPr>
+            <w:tcW w:type="dxa" w:w="3024"/>
             <w:shd w:val="clear" w:fill="FAF9F6"/>
           </w:tcPr>
           <w:p>
@@ -4859,9 +5176,27 @@
             </w:pPr>
             <w:r>
               <w:rPr>
+                <w:rFonts w:ascii="Consolas" w:hAnsi="Consolas"/>
+                <w:sz w:val="17"/>
+              </w:rPr>
+              <w:t>delivered_depth_mm</w:t>
+            </w:r>
+          </w:p>
+        </w:tc>
+        <w:tc>
+          <w:tcPr>
+            <w:tcW w:type="dxa" w:w="4176"/>
+            <w:shd w:val="clear" w:fill="FAF9F6"/>
+          </w:tcPr>
+          <w:p>
+            <w:pPr>
+              <w:spacing w:after="40" w:before="40"/>
+            </w:pPr>
+            <w:r>
+              <w:rPr>
                 <w:sz w:val="18"/>
               </w:rPr>
-              <w:t>First and last moment of the run.</w:t>
+              <w:t>Millimetres the granted hours deliver.</w:t>
             </w:r>
           </w:p>
         </w:tc>
@@ -4897,7 +5232,7 @@
                 <w:rFonts w:ascii="Consolas" w:hAnsi="Consolas"/>
                 <w:sz w:val="17"/>
               </w:rPr>
-              <w:t>delivered_depth_mm</w:t>
+              <w:t>unmet_deficit_mm</w:t>
             </w:r>
           </w:p>
         </w:tc>
@@ -4913,7 +5248,7 @@
               <w:rPr>
                 <w:sz w:val="18"/>
               </w:rPr>
-              <w:t>Millimetres the granted hours deliver.</w:t>
+              <w:t>Shortfall — becomes next week's carried debt.</w:t>
             </w:r>
           </w:p>
         </w:tc>
@@ -4949,7 +5284,7 @@
                 <w:rFonts w:ascii="Consolas" w:hAnsi="Consolas"/>
                 <w:sz w:val="17"/>
               </w:rPr>
-              <w:t>unmet_deficit_mm</w:t>
+              <w:t>capacity_warning</w:t>
             </w:r>
           </w:p>
         </w:tc>
@@ -4966,7 +5301,7 @@
               <w:rPr>
                 <w:sz w:val="18"/>
               </w:rPr>
-              <w:t>Shortfall — becomes next week's carried debt.</w:t>
+              <w:t>Why the grant fell short, in plain words.</w:t>
             </w:r>
           </w:p>
         </w:tc>
@@ -4974,57 +5309,6 @@
           <w:tcPr>
             <w:tcW w:type="dxa" w:w="1440"/>
             <w:shd w:val="clear" w:fill="FAF9F6"/>
-          </w:tcPr>
-          <w:p>
-            <w:pPr>
-              <w:spacing w:after="40" w:before="40"/>
-            </w:pPr>
-            <w:r>
-              <w:rPr>
-                <w:sz w:val="18"/>
-              </w:rPr>
-              <w:t>Scheduler</w:t>
-            </w:r>
-          </w:p>
-        </w:tc>
-      </w:tr>
-      <w:tr>
-        <w:tc>
-          <w:tcPr>
-            <w:tcW w:type="dxa" w:w="3024"/>
-          </w:tcPr>
-          <w:p>
-            <w:pPr>
-              <w:spacing w:after="40" w:before="40"/>
-            </w:pPr>
-            <w:r>
-              <w:rPr>
-                <w:rFonts w:ascii="Consolas" w:hAnsi="Consolas"/>
-                <w:sz w:val="17"/>
-              </w:rPr>
-              <w:t>capacity_warning</w:t>
-            </w:r>
-          </w:p>
-        </w:tc>
-        <w:tc>
-          <w:tcPr>
-            <w:tcW w:type="dxa" w:w="4176"/>
-          </w:tcPr>
-          <w:p>
-            <w:pPr>
-              <w:spacing w:after="40" w:before="40"/>
-            </w:pPr>
-            <w:r>
-              <w:rPr>
-                <w:sz w:val="18"/>
-              </w:rPr>
-              <w:t>Why the grant fell short, in plain words.</w:t>
-            </w:r>
-          </w:p>
-        </w:tc>
-        <w:tc>
-          <w:tcPr>
-            <w:tcW w:type="dxa" w:w="1440"/>
           </w:tcPr>
           <w:p>
             <w:pPr>
@@ -5677,6 +5961,111 @@
                 <w:rFonts w:ascii="Consolas" w:hAnsi="Consolas"/>
                 <w:sz w:val="17"/>
               </w:rPr>
+              <w:t>default_pump_flow_rate_m3_per_hr</w:t>
+            </w:r>
+          </w:p>
+        </w:tc>
+        <w:tc>
+          <w:tcPr>
+            <w:tcW w:type="dxa" w:w="4032"/>
+          </w:tcPr>
+          <w:p>
+            <w:pPr>
+              <w:spacing w:after="40" w:before="40"/>
+            </w:pPr>
+            <w:r>
+              <w:rPr>
+                <w:sz w:val="18"/>
+              </w:rPr>
+              <w:t>Stand-in pump flow where a section has no profile.</w:t>
+            </w:r>
+          </w:p>
+        </w:tc>
+        <w:tc>
+          <w:tcPr>
+            <w:tcW w:type="dxa" w:w="1440"/>
+          </w:tcPr>
+          <w:p>
+            <w:pPr>
+              <w:spacing w:after="40" w:before="40"/>
+            </w:pPr>
+            <w:r>
+              <w:rPr>
+                <w:sz w:val="18"/>
+              </w:rPr>
+              <w:t>25 m³/hr</w:t>
+            </w:r>
+          </w:p>
+        </w:tc>
+      </w:tr>
+      <w:tr>
+        <w:tc>
+          <w:tcPr>
+            <w:tcW w:type="dxa" w:w="3168"/>
+            <w:shd w:val="clear" w:fill="FAF9F6"/>
+          </w:tcPr>
+          <w:p>
+            <w:pPr>
+              <w:spacing w:after="40" w:before="40"/>
+            </w:pPr>
+            <w:r>
+              <w:rPr>
+                <w:rFonts w:ascii="Consolas" w:hAnsi="Consolas"/>
+                <w:sz w:val="17"/>
+              </w:rPr>
+              <w:t>default_water_target_m3_per_week</w:t>
+            </w:r>
+          </w:p>
+        </w:tc>
+        <w:tc>
+          <w:tcPr>
+            <w:tcW w:type="dxa" w:w="4032"/>
+            <w:shd w:val="clear" w:fill="FAF9F6"/>
+          </w:tcPr>
+          <w:p>
+            <w:pPr>
+              <w:spacing w:after="40" w:before="40"/>
+            </w:pPr>
+            <w:r>
+              <w:rPr>
+                <w:sz w:val="18"/>
+              </w:rPr>
+              <w:t>Stand-in weekly volume. Divided by the flow this is the hour budget.</w:t>
+            </w:r>
+          </w:p>
+        </w:tc>
+        <w:tc>
+          <w:tcPr>
+            <w:tcW w:type="dxa" w:w="1440"/>
+            <w:shd w:val="clear" w:fill="FAF9F6"/>
+          </w:tcPr>
+          <w:p>
+            <w:pPr>
+              <w:spacing w:after="40" w:before="40"/>
+            </w:pPr>
+            <w:r>
+              <w:rPr>
+                <w:sz w:val="18"/>
+              </w:rPr>
+              <w:t>3500 m³</w:t>
+            </w:r>
+          </w:p>
+        </w:tc>
+      </w:tr>
+      <w:tr>
+        <w:tc>
+          <w:tcPr>
+            <w:tcW w:type="dxa" w:w="3168"/>
+          </w:tcPr>
+          <w:p>
+            <w:pPr>
+              <w:spacing w:after="40" w:before="40"/>
+            </w:pPr>
+            <w:r>
+              <w:rPr>
+                <w:rFonts w:ascii="Consolas" w:hAnsi="Consolas"/>
+                <w:sz w:val="17"/>
+              </w:rPr>
               <w:t>organisation_name</w:t>
             </w:r>
           </w:p>
@@ -6282,7 +6671,110 @@
               <w:rPr>
                 <w:sz w:val="18"/>
               </w:rPr>
-              <w:t>Child table and its doctype removed.</w:t>
+              <w:t>Child table removed; rate and coverage moved onto Block Type, where they are read.</w:t>
+            </w:r>
+          </w:p>
+        </w:tc>
+      </w:tr>
+      <w:tr>
+        <w:tc>
+          <w:tcPr>
+            <w:tcW w:type="dxa" w:w="2880"/>
+            <w:shd w:val="clear" w:fill="FAF9F6"/>
+          </w:tcPr>
+          <w:p>
+            <w:pPr>
+              <w:spacing w:after="40" w:before="40"/>
+            </w:pPr>
+            <w:r>
+              <w:rPr>
+                <w:sz w:val="18"/>
+              </w:rPr>
+              <w:t>Millimetres were summed across shifts.</w:t>
+            </w:r>
+          </w:p>
+        </w:tc>
+        <w:tc>
+          <w:tcPr>
+            <w:tcW w:type="dxa" w:w="3168"/>
+            <w:shd w:val="clear" w:fill="FAF9F6"/>
+          </w:tcPr>
+          <w:p>
+            <w:pPr>
+              <w:spacing w:after="40" w:before="40"/>
+            </w:pPr>
+            <w:r>
+              <w:rPr>
+                <w:sz w:val="18"/>
+              </w:rPr>
+              <w:t>55 shifts each owing 89 mm reported 4,900 mm — depth is per unit area and does not add, so the figure had no physical meaning.</w:t>
+            </w:r>
+          </w:p>
+        </w:tc>
+        <w:tc>
+          <w:tcPr>
+            <w:tcW w:type="dxa" w:w="2592"/>
+            <w:shd w:val="clear" w:fill="FAF9F6"/>
+          </w:tcPr>
+          <w:p>
+            <w:pPr>
+              <w:spacing w:after="40" w:before="40"/>
+            </w:pPr>
+            <w:r>
+              <w:rPr>
+                <w:sz w:val="18"/>
+              </w:rPr>
+              <w:t>Depths are averaged per shift and labelled as such; only hours are summed.</w:t>
+            </w:r>
+          </w:p>
+        </w:tc>
+      </w:tr>
+      <w:tr>
+        <w:tc>
+          <w:tcPr>
+            <w:tcW w:type="dxa" w:w="2880"/>
+          </w:tcPr>
+          <w:p>
+            <w:pPr>
+              <w:spacing w:after="40" w:before="40"/>
+            </w:pPr>
+            <w:r>
+              <w:rPr>
+                <w:sz w:val="18"/>
+              </w:rPr>
+              <w:t>A missing pump profile fell straight to a full 168 hr week.</w:t>
+            </w:r>
+          </w:p>
+        </w:tc>
+        <w:tc>
+          <w:tcPr>
+            <w:tcW w:type="dxa" w:w="3168"/>
+          </w:tcPr>
+          <w:p>
+            <w:pPr>
+              <w:spacing w:after="40" w:before="40"/>
+            </w:pPr>
+            <w:r>
+              <w:rPr>
+                <w:sz w:val="18"/>
+              </w:rPr>
+              <w:t>Technically honest but useless as a limit, and every planner carried the same unverified warning.</w:t>
+            </w:r>
+          </w:p>
+        </w:tc>
+        <w:tc>
+          <w:tcPr>
+            <w:tcW w:type="dxa" w:w="2592"/>
+          </w:tcPr>
+          <w:p>
+            <w:pPr>
+              <w:spacing w:after="40" w:before="40"/>
+            </w:pPr>
+            <w:r>
+              <w:rPr>
+                <w:sz w:val="18"/>
+              </w:rPr>
+              <w:t>A farm-wide default sits between the two, with its provenance reported.</w:t>
             </w:r>
           </w:p>
         </w:tc>
@@ -6680,7 +7172,7 @@
               <w:rPr>
                 <w:sz w:val="18"/>
               </w:rPr>
-              <w:t>52, passing</w:t>
+              <w:t>74, passing</w:t>
             </w:r>
           </w:p>
         </w:tc>
@@ -6706,7 +7198,7 @@
         <w:ind w:left="360"/>
       </w:pPr>
       <w:r>
-        <w:t>No Irrigation Pump Profile exists on the live site. Until one is created per section, capacity is an assumed 168 hr/wk, every planner carries an "unverified" warning, and all sections are sequenced as though they share one pump. This is the single highest-value data entry task outstanding.</w:t>
+        <w:t>No Irrigation Pump Profile exists on the live site. Capacity therefore comes from the Irrigation Settings default of 140 hr/wk, every planner says so, and all sections are sequenced as though they share one pump. Creating one profile per section is the single highest-value data entry task outstanding — the default is deliberately conservative, so the real ceiling is probably higher.</w:t>
       </w:r>
     </w:p>
     <w:p>
@@ -6716,7 +7208,7 @@
         <w:ind w:left="360"/>
       </w:pPr>
       <w:r>
-        <w:t>Every shift on a farm currently produces identical demand, because nothing in the model is shift-specific — no per-shift area, crop age or coefficient. Proportional capping therefore degenerates to equal shares. Adding per-shift area would make the allocation genuinely differentiated.</w:t>
+        <w:t>Every shift on a farm produces identical demand by default, which is intended for now. Rate and coverage can be overridden per shift on Block Type when a section's emitters genuinely differ; until they are set, proportional capping reduces to equal shares. Per-shift irrigated area would let the model reason about volume rather than depth, which is the next real step.</w:t>
       </w:r>
     </w:p>
     <w:p>
@@ -6736,7 +7228,7 @@
         <w:ind w:left="360"/>
       </w:pPr>
       <w:r>
-        <w:t>Phase 2 of the rebuild covers visualisation: the week Gantt, pump load, water balance and a calculation explainer that shows an operator exactly how a shift's hours were derived.</w:t>
+        <w:t>The Planning view (/upande-irrigation#planner) now carries the week Gantt on a real clock axis, pump load per day against the 24 h a day offers, the water balance in mean mm per shift, and a step-by-step trace of how one shift's hours were decided. Every chart has a Table toggle, so none of it depends on colour alone.</w:t>
       </w:r>
     </w:p>
     <w:p>
@@ -6970,7 +7462,7 @@
                 <w:rFonts w:ascii="Consolas" w:hAnsi="Consolas"/>
                 <w:sz w:val="17"/>
               </w:rPr>
-              <w:t>upande_irrigation/api/overview.py</w:t>
+              <w:t>upande_irrigation/api/planner.py</w:t>
             </w:r>
           </w:p>
         </w:tc>
@@ -6986,7 +7478,7 @@
               <w:rPr>
                 <w:sz w:val="18"/>
               </w:rPr>
-              <w:t>Dashboard read model: tiles, alerts, schedule grid, deficit trend.</w:t>
+              <w:t>Planning read model: Gantt windows, pump load, water balance, and the calculation trace.</w:t>
             </w:r>
           </w:p>
         </w:tc>
@@ -7006,7 +7498,7 @@
                 <w:rFonts w:ascii="Consolas" w:hAnsi="Consolas"/>
                 <w:sz w:val="17"/>
               </w:rPr>
-              <w:t>upande_irrigation/tests/</w:t>
+              <w:t>upande_irrigation/api/overview.py</w:t>
             </w:r>
           </w:p>
         </w:tc>
@@ -7023,7 +7515,79 @@
               <w:rPr>
                 <w:sz w:val="18"/>
               </w:rPr>
-              <w:t>52 tests. Each module's docstring names the defect it locks out.</w:t>
+              <w:t>Dashboard read model: tiles, alerts, schedule grid, deficit trend.</w:t>
+            </w:r>
+          </w:p>
+        </w:tc>
+      </w:tr>
+      <w:tr>
+        <w:tc>
+          <w:tcPr>
+            <w:tcW w:type="dxa" w:w="3888"/>
+          </w:tcPr>
+          <w:p>
+            <w:pPr>
+              <w:spacing w:after="40" w:before="40"/>
+            </w:pPr>
+            <w:r>
+              <w:rPr>
+                <w:rFonts w:ascii="Consolas" w:hAnsi="Consolas"/>
+                <w:sz w:val="17"/>
+              </w:rPr>
+              <w:t>upande_irrigation/public/js/dashboard/palette.js</w:t>
+            </w:r>
+          </w:p>
+        </w:tc>
+        <w:tc>
+          <w:tcPr>
+            <w:tcW w:type="dxa" w:w="4752"/>
+          </w:tcPr>
+          <w:p>
+            <w:pPr>
+              <w:spacing w:after="40" w:before="40"/>
+            </w:pPr>
+            <w:r>
+              <w:rPr>
+                <w:sz w:val="18"/>
+              </w:rPr>
+              <w:t>The validated series ramp, with its validator output recorded.</w:t>
+            </w:r>
+          </w:p>
+        </w:tc>
+      </w:tr>
+      <w:tr>
+        <w:tc>
+          <w:tcPr>
+            <w:tcW w:type="dxa" w:w="3888"/>
+            <w:shd w:val="clear" w:fill="FAF9F6"/>
+          </w:tcPr>
+          <w:p>
+            <w:pPr>
+              <w:spacing w:after="40" w:before="40"/>
+            </w:pPr>
+            <w:r>
+              <w:rPr>
+                <w:rFonts w:ascii="Consolas" w:hAnsi="Consolas"/>
+                <w:sz w:val="17"/>
+              </w:rPr>
+              <w:t>upande_irrigation/tests/</w:t>
+            </w:r>
+          </w:p>
+        </w:tc>
+        <w:tc>
+          <w:tcPr>
+            <w:tcW w:type="dxa" w:w="4752"/>
+            <w:shd w:val="clear" w:fill="FAF9F6"/>
+          </w:tcPr>
+          <w:p>
+            <w:pPr>
+              <w:spacing w:after="40" w:before="40"/>
+            </w:pPr>
+            <w:r>
+              <w:rPr>
+                <w:sz w:val="18"/>
+              </w:rPr>
+              <w:t>74 tests. Each module's docstring names the defect it locks out.</w:t>
             </w:r>
           </w:p>
         </w:tc>

</xml_diff>